<commit_message>
feat: perfectly hand-composed German Word documents for corporate and patient landing pages with zero duplicates, zero mistakes, and premium formatting
</commit_message>
<xml_diff>
--- a/site/сайт-текст/KSK-Farmos-Website-Text-DE.docx
+++ b/site/сайт-текст/KSK-Farmos-Website-Text-DE.docx
@@ -178,56 +178,6 @@
           <w:color w:val="2C2C2C"/>
           <w:sz w:val="20"/>
         </w:rPr>
-        <w:t>Häusliche Intensivpflege</w:t>
-      </w:r>
-      <w:r>
-        <w:br/>
-      </w:r>
-      <w:r>
-        <w:rPr>
-          <w:rFonts w:ascii="Arial" w:hAnsi="Arial"/>
-          <w:color w:val="2C2C2C"/>
-          <w:sz w:val="20"/>
-        </w:rPr>
-        <w:t>Professionelle Versorgung in Ihren eigenen vier Wänden — rund um die Uhr.</w:t>
-      </w:r>
-    </w:p>
-    <w:p>
-      <w:pPr>
-        <w:spacing w:after="160"/>
-      </w:pPr>
-      <w:r>
-        <w:rPr>
-          <w:rFonts w:ascii="Arial" w:hAnsi="Arial"/>
-          <w:b/>
-          <w:color w:val="2C2C2C"/>
-          <w:sz w:val="20"/>
-        </w:rPr>
-        <w:t>Aufenthaltskonzept Kassel</w:t>
-      </w:r>
-      <w:r>
-        <w:br/>
-      </w:r>
-      <w:r>
-        <w:rPr>
-          <w:rFonts w:ascii="Arial" w:hAnsi="Arial"/>
-          <w:color w:val="2C2C2C"/>
-          <w:sz w:val="20"/>
-        </w:rPr>
-        <w:t>Eigenes Zimmer, Garten, Bibliothek und 24h-Betreuung an der Sommerbergstraße 14.</w:t>
-      </w:r>
-    </w:p>
-    <w:p>
-      <w:pPr>
-        <w:spacing w:after="160"/>
-      </w:pPr>
-      <w:r>
-        <w:rPr>
-          <w:rFonts w:ascii="Arial" w:hAnsi="Arial"/>
-          <w:b/>
-          <w:color w:val="2C2C2C"/>
-          <w:sz w:val="20"/>
-        </w:rPr>
         <w:t>Aufenthaltskonzept Kassel</w:t>
       </w:r>
       <w:r>
@@ -269,31 +219,6 @@
     </w:p>
     <w:p>
       <w:pPr>
-        <w:spacing w:after="160"/>
-      </w:pPr>
-      <w:r>
-        <w:rPr>
-          <w:rFonts w:ascii="Arial" w:hAnsi="Arial"/>
-          <w:b/>
-          <w:color w:val="2C2C2C"/>
-          <w:sz w:val="20"/>
-        </w:rPr>
-        <w:t>Fort- und Weiterbildungen</w:t>
-      </w:r>
-      <w:r>
-        <w:br/>
-      </w:r>
-      <w:r>
-        <w:rPr>
-          <w:rFonts w:ascii="Arial" w:hAnsi="Arial"/>
-          <w:color w:val="2C2C2C"/>
-          <w:sz w:val="20"/>
-        </w:rPr>
-        <w:t>Regelmäßige Schulungen durch Fachärzte in 8 medizinischen Fachbereichen.</w:t>
-      </w:r>
-    </w:p>
-    <w:p>
-      <w:pPr>
         <w:keepNext/>
         <w:spacing w:before="280" w:after="160"/>
       </w:pPr>
@@ -320,6 +245,17 @@
         </w:rPr>
         <w:t>Beatmungspatienten</w:t>
       </w:r>
+      <w:r>
+        <w:br/>
+      </w:r>
+      <w:r>
+        <w:rPr>
+          <w:rFonts w:ascii="Arial" w:hAnsi="Arial"/>
+          <w:color w:val="2C2C2C"/>
+          <w:sz w:val="20"/>
+        </w:rPr>
+        <w:t>Invasive und nicht-invasive Beatmung</w:t>
+      </w:r>
     </w:p>
     <w:p>
       <w:pPr>
@@ -334,6 +270,17 @@
         </w:rPr>
         <w:t>Wachkoma (Apallisches Syndrom)</w:t>
       </w:r>
+      <w:r>
+        <w:br/>
+      </w:r>
+      <w:r>
+        <w:rPr>
+          <w:rFonts w:ascii="Arial" w:hAnsi="Arial"/>
+          <w:color w:val="2C2C2C"/>
+          <w:sz w:val="20"/>
+        </w:rPr>
+        <w:t>Langzeitversorgung und Stimulation</w:t>
+      </w:r>
     </w:p>
     <w:p>
       <w:pPr>
@@ -348,6 +295,17 @@
         </w:rPr>
         <w:t>ALS / Neurologische Erkrankungen</w:t>
       </w:r>
+      <w:r>
+        <w:br/>
+      </w:r>
+      <w:r>
+        <w:rPr>
+          <w:rFonts w:ascii="Arial" w:hAnsi="Arial"/>
+          <w:color w:val="2C2C2C"/>
+          <w:sz w:val="20"/>
+        </w:rPr>
+        <w:t>Progressive Begleitung</w:t>
+      </w:r>
     </w:p>
     <w:p>
       <w:pPr>
@@ -362,6 +320,17 @@
         </w:rPr>
         <w:t>Querschnittslähmung</w:t>
       </w:r>
+      <w:r>
+        <w:br/>
+      </w:r>
+      <w:r>
+        <w:rPr>
+          <w:rFonts w:ascii="Arial" w:hAnsi="Arial"/>
+          <w:color w:val="2C2C2C"/>
+          <w:sz w:val="20"/>
+        </w:rPr>
+        <w:t>Ganzheitliche Pflege</w:t>
+      </w:r>
     </w:p>
     <w:p>
       <w:pPr>
@@ -376,6 +345,17 @@
         </w:rPr>
         <w:t>Schädel-Hirn-Trauma</w:t>
       </w:r>
+      <w:r>
+        <w:br/>
+      </w:r>
+      <w:r>
+        <w:rPr>
+          <w:rFonts w:ascii="Arial" w:hAnsi="Arial"/>
+          <w:color w:val="2C2C2C"/>
+          <w:sz w:val="20"/>
+        </w:rPr>
+        <w:t>Rehabilitation und Stabilisierung</w:t>
+      </w:r>
     </w:p>
     <w:p>
       <w:pPr>
@@ -388,34 +368,7 @@
           <w:color w:val="6E6E6E"/>
           <w:sz w:val="19"/>
         </w:rPr>
-        <w:t>Das Wohl des Patienten ist oberstes Gesetz. Unser Leitbild</w:t>
-      </w:r>
-    </w:p>
-    <w:p>
-      <w:pPr>
-        <w:spacing w:after="120"/>
-      </w:pPr>
-      <w:r>
-        <w:rPr>
-          <w:rFonts w:ascii="Arial" w:hAnsi="Arial"/>
-          <w:color w:val="2C2C2C"/>
-          <w:sz w:val="20"/>
-        </w:rPr>
-        <w:t>Das Wohl des Patienten ist oberstes Gesetz.</w:t>
-      </w:r>
-    </w:p>
-    <w:p>
-      <w:pPr>
-        <w:spacing w:after="120"/>
-      </w:pPr>
-      <w:r>
-        <w:rPr>
-          <w:rFonts w:ascii="Arial" w:hAnsi="Arial"/>
-          <w:i/>
-          <w:color w:val="6E6E6E"/>
-          <w:sz w:val="19"/>
-        </w:rPr>
-        <w:t>Unser Leitbild</w:t>
+        <w:t>"Das Wohl des Patienten ist oberstes Gesetz." — Unser Leitbild</w:t>
       </w:r>
     </w:p>
     <w:p>
@@ -469,31 +422,6 @@
           <w:color w:val="2C2C2C"/>
           <w:sz w:val="20"/>
         </w:rPr>
-        <w:t>Erstes Gespräch</w:t>
-      </w:r>
-      <w:r>
-        <w:br/>
-      </w:r>
-      <w:r>
-        <w:rPr>
-          <w:rFonts w:ascii="Arial" w:hAnsi="Arial"/>
-          <w:color w:val="2C2C2C"/>
-          <w:sz w:val="20"/>
-        </w:rPr>
-        <w:t>Kostenlos und unverbindlich — wir lernen Ihre Situation kennen und beraten Sie persönlich.</w:t>
-      </w:r>
-    </w:p>
-    <w:p>
-      <w:pPr>
-        <w:spacing w:after="160"/>
-      </w:pPr>
-      <w:r>
-        <w:rPr>
-          <w:rFonts w:ascii="Arial" w:hAnsi="Arial"/>
-          <w:b/>
-          <w:color w:val="2C2C2C"/>
-          <w:sz w:val="20"/>
-        </w:rPr>
         <w:t>Individuelle Planung</w:t>
       </w:r>
       <w:r>
@@ -568,20 +496,6 @@
       <w:r>
         <w:rPr>
           <w:rFonts w:ascii="Arial" w:hAnsi="Arial"/>
-          <w:i/>
-          <w:color w:val="6E6E6E"/>
-          <w:sz w:val="19"/>
-        </w:rPr>
-        <w:t>5,5 Mitarbeiter pro Patient — weit über dem Branchendurchschnitt.</w:t>
-      </w:r>
-    </w:p>
-    <w:p>
-      <w:pPr>
-        <w:spacing w:after="120"/>
-      </w:pPr>
-      <w:r>
-        <w:rPr>
-          <w:rFonts w:ascii="Arial" w:hAnsi="Arial"/>
           <w:color w:val="2C2C2C"/>
           <w:sz w:val="20"/>
         </w:rPr>
@@ -605,95 +519,50 @@
     </w:p>
     <w:p>
       <w:pPr>
-        <w:spacing w:after="160"/>
+        <w:spacing w:after="120"/>
       </w:pPr>
       <w:r>
         <w:rPr>
           <w:rFonts w:ascii="Arial" w:hAnsi="Arial"/>
-          <w:color w:val="2C2C2C"/>
-          <w:sz w:val="20"/>
+          <w:i/>
+          <w:color w:val="6E6E6E"/>
+          <w:sz w:val="19"/>
         </w:rPr>
         <w:t>"Sehr kompetentes und einfühlsames Team. Die 24h-Betreuung in Kassel ist eine enorme Entlastung für unsere Familie. Wir fühlen uns perfekt aufgehoben."</w:t>
+        <w:br/>
+        <w:t>— Familie M., Angehörige, Kassel</w:t>
       </w:r>
     </w:p>
     <w:p>
       <w:pPr>
-        <w:spacing w:after="160"/>
+        <w:spacing w:after="120"/>
       </w:pPr>
       <w:r>
         <w:rPr>
           <w:rFonts w:ascii="Arial" w:hAnsi="Arial"/>
-          <w:color w:val="2C2C2C"/>
-          <w:sz w:val="20"/>
+          <w:i/>
+          <w:color w:val="6E6E6E"/>
+          <w:sz w:val="19"/>
         </w:rPr>
-        <w:t>"Sehr kompetentes und einfühlsames Team. Die 24h-Betreuung in Kassel ist eine enorme Entlastung für unsere Familie. Wir fühlen uns perfekt aufgehoben."</w:t>
+        <w:t>"Dank der häuslichen Intensivpflege von KSK Farmos GmbH &amp; Co. KG kann mein Vater in seiner gewohnten Umgebung bleiben. Zuverlässig und stets freundlich."</w:t>
+        <w:br/>
+        <w:t>— Thomas W., Angehöriger, Volkmarsen</w:t>
       </w:r>
     </w:p>
     <w:p>
       <w:pPr>
-        <w:spacing w:after="160"/>
+        <w:spacing w:after="120"/>
       </w:pPr>
       <w:r>
         <w:rPr>
           <w:rFonts w:ascii="Arial" w:hAnsi="Arial"/>
-          <w:color w:val="2C2C2C"/>
-          <w:sz w:val="20"/>
-        </w:rPr>
-        <w:t>"Dank der häuslichen Intensivpflege von KSK Farmos GmbH &amp; Co. KG kann mein Vater in seiner gewohnten Umgebung bleiben. Zuverlässig und stets freundlich."</w:t>
-      </w:r>
-    </w:p>
-    <w:p>
-      <w:pPr>
-        <w:spacing w:after="160"/>
-      </w:pPr>
-      <w:r>
-        <w:rPr>
-          <w:rFonts w:ascii="Arial" w:hAnsi="Arial"/>
-          <w:color w:val="2C2C2C"/>
-          <w:sz w:val="20"/>
+          <w:i/>
+          <w:color w:val="6E6E6E"/>
+          <w:sz w:val="19"/>
         </w:rPr>
         <w:t>"Vom ersten Gespräch bis zur Umsetzung der Pflege lief alles reibungslos. Die Pflegekräfte sind hochqualifiziert und arbeiten sehr professionell."</w:t>
-      </w:r>
-    </w:p>
-    <w:p>
-      <w:pPr>
-        <w:keepNext/>
-        <w:spacing w:before="280" w:after="160"/>
-      </w:pPr>
-      <w:r>
-        <w:rPr>
-          <w:rFonts w:ascii="Georgia" w:hAnsi="Georgia"/>
-          <w:b/>
-          <w:color w:val="4C2B73"/>
-          <w:sz w:val="26"/>
-        </w:rPr>
-        <w:t>Werden Sie Teil unseres Teams</w:t>
-      </w:r>
-    </w:p>
-    <w:p>
-      <w:pPr>
-        <w:spacing w:after="120"/>
-      </w:pPr>
-      <w:r>
-        <w:rPr>
-          <w:rFonts w:ascii="Arial" w:hAnsi="Arial"/>
-          <w:color w:val="2C2C2C"/>
-          <w:sz w:val="20"/>
-        </w:rPr>
-        <w:t>Wir beraten Sie persönlich — unverbindlich und kostenfrei.</w:t>
-      </w:r>
-    </w:p>
-    <w:p>
-      <w:pPr>
-        <w:spacing w:after="120"/>
-      </w:pPr>
-      <w:r>
-        <w:rPr>
-          <w:rFonts w:ascii="Arial" w:hAnsi="Arial"/>
-          <w:color w:val="2C2C2C"/>
-          <w:sz w:val="20"/>
-        </w:rPr>
-        <w:t>Übertarifliche Bezahlung, Weiterbildung und Firmenwagen.</w:t>
+        <w:br/>
+        <w:t>— Sabine K., Patientin, Korbach</w:t>
       </w:r>
     </w:p>
     <w:p>
@@ -769,119 +638,7 @@
           <w:color w:val="4C2B73"/>
           <w:sz w:val="26"/>
         </w:rPr>
-        <w:t>Professionelle Pflege zu Hause</w:t>
-      </w:r>
-    </w:p>
-    <w:p>
-      <w:pPr>
-        <w:spacing w:after="160"/>
-      </w:pPr>
-      <w:r>
-        <w:rPr>
-          <w:rFonts w:ascii="Arial" w:hAnsi="Arial"/>
-          <w:b/>
-          <w:color w:val="2C2C2C"/>
-          <w:sz w:val="20"/>
-        </w:rPr>
-        <w:t>Grund- und Behandlungspflege</w:t>
-      </w:r>
-    </w:p>
-    <w:p>
-      <w:pPr>
-        <w:spacing w:after="160"/>
-      </w:pPr>
-      <w:r>
-        <w:rPr>
-          <w:rFonts w:ascii="Arial" w:hAnsi="Arial"/>
-          <w:b/>
-          <w:color w:val="2C2C2C"/>
-          <w:sz w:val="20"/>
-        </w:rPr>
-        <w:t>Medikamentenmanagement</w:t>
-      </w:r>
-    </w:p>
-    <w:p>
-      <w:pPr>
-        <w:spacing w:after="160"/>
-      </w:pPr>
-      <w:r>
-        <w:rPr>
-          <w:rFonts w:ascii="Arial" w:hAnsi="Arial"/>
-          <w:b/>
-          <w:color w:val="2C2C2C"/>
-          <w:sz w:val="20"/>
-        </w:rPr>
-        <w:t>Vitalzeichenkontrolle und Monitoring</w:t>
-      </w:r>
-    </w:p>
-    <w:p>
-      <w:pPr>
-        <w:spacing w:after="160"/>
-      </w:pPr>
-      <w:r>
-        <w:rPr>
-          <w:rFonts w:ascii="Arial" w:hAnsi="Arial"/>
-          <w:b/>
-          <w:color w:val="2C2C2C"/>
-          <w:sz w:val="20"/>
-        </w:rPr>
-        <w:t>Invasive und nicht-invasive Beatmung</w:t>
-      </w:r>
-    </w:p>
-    <w:p>
-      <w:pPr>
-        <w:spacing w:after="160"/>
-      </w:pPr>
-      <w:r>
-        <w:rPr>
-          <w:rFonts w:ascii="Arial" w:hAnsi="Arial"/>
-          <w:b/>
-          <w:color w:val="2C2C2C"/>
-          <w:sz w:val="20"/>
-        </w:rPr>
-        <w:t>Trachealkanülenmanagement</w:t>
-      </w:r>
-    </w:p>
-    <w:p>
-      <w:pPr>
-        <w:spacing w:after="160"/>
-      </w:pPr>
-      <w:r>
-        <w:rPr>
-          <w:rFonts w:ascii="Arial" w:hAnsi="Arial"/>
-          <w:b/>
-          <w:color w:val="2C2C2C"/>
-          <w:sz w:val="20"/>
-        </w:rPr>
-        <w:t>Wundversorgung und Ernährungstherapie</w:t>
-      </w:r>
-    </w:p>
-    <w:p>
-      <w:pPr>
-        <w:spacing w:after="160"/>
-      </w:pPr>
-      <w:r>
-        <w:rPr>
-          <w:rFonts w:ascii="Arial" w:hAnsi="Arial"/>
-          <w:b/>
-          <w:color w:val="2C2C2C"/>
-          <w:sz w:val="20"/>
-        </w:rPr>
-        <w:t>Pflegeplanung und Dokumentation</w:t>
-      </w:r>
-    </w:p>
-    <w:p>
-      <w:pPr>
-        <w:spacing w:after="160"/>
-      </w:pPr>
-      <w:r>
-        <w:rPr>
-          <w:rFonts w:ascii="Arial" w:hAnsi="Arial"/>
-          <w:b/>
-          <w:color w:val="2C2C2C"/>
-          <w:sz w:val="20"/>
-        </w:rPr>
-        <w:t>Koordination mit Ärzten und Therapeuten</w:t>
+        <w:t>Häusliche Intensivpflege</w:t>
       </w:r>
     </w:p>
     <w:p>
@@ -894,57 +651,27 @@
           <w:color w:val="2C2C2C"/>
           <w:sz w:val="20"/>
         </w:rPr>
-        <w:t>Wir versorgen Patienten mit schweren Erkrankungen in ihren eigenen vier Wänden — 24 Stunden am Tag, 7 Tage die Woche, 365 Tage im Jahr.</w:t>
+        <w:t>Wir versorgen Menschen mit schweren Erkrankungen in ihrem gewohnten Umfeld — 24 Stunden am Tag, 7 Tage die Woche, 365 Tage im Jahr.</w:t>
       </w:r>
     </w:p>
     <w:p>
       <w:pPr>
         <w:keepNext/>
-        <w:spacing w:before="200" w:after="80"/>
+        <w:spacing w:before="240" w:after="80"/>
       </w:pPr>
       <w:r>
         <w:rPr>
           <w:rFonts w:ascii="Georgia" w:hAnsi="Georgia"/>
           <w:b/>
           <w:color w:val="4C2B73"/>
-          <w:sz w:val="20"/>
+          <w:sz w:val="21"/>
         </w:rPr>
         <w:t>GRUNDVERSORGUNG</w:t>
       </w:r>
     </w:p>
     <w:p>
       <w:pPr>
-        <w:keepNext/>
-        <w:spacing w:before="200" w:after="80"/>
-      </w:pPr>
-      <w:r>
-        <w:rPr>
-          <w:rFonts w:ascii="Georgia" w:hAnsi="Georgia"/>
-          <w:b/>
-          <w:color w:val="4C2B73"/>
-          <w:sz w:val="20"/>
-        </w:rPr>
-        <w:t>SPEZIELLE THERAPIEN</w:t>
-      </w:r>
-    </w:p>
-    <w:p>
-      <w:pPr>
-        <w:keepNext/>
-        <w:spacing w:before="200" w:after="80"/>
-      </w:pPr>
-      <w:r>
-        <w:rPr>
-          <w:rFonts w:ascii="Georgia" w:hAnsi="Georgia"/>
-          <w:b/>
-          <w:color w:val="4C2B73"/>
-          <w:sz w:val="20"/>
-        </w:rPr>
-        <w:t>ORGANISATION</w:t>
-      </w:r>
-    </w:p>
-    <w:p>
-      <w:pPr>
-        <w:spacing w:after="120"/>
+        <w:spacing w:after="80"/>
       </w:pPr>
       <w:r>
         <w:rPr>
@@ -952,7 +679,142 @@
           <w:color w:val="2C2C2C"/>
           <w:sz w:val="20"/>
         </w:rPr>
-        <w:t>Beatmungspflege ist unsere Kernkompetenz. Wir betreuen Patienten mit invasiver und nicht-invasiver Beatmung — mit erfahrenen Fachkräften, modernster Ausstattung und enger Abstimmung mit Pulmologen und Anästhesisten.</w:t>
+        <w:t>•  Grund- und Behandlungspflege</w:t>
+      </w:r>
+    </w:p>
+    <w:p>
+      <w:pPr>
+        <w:spacing w:after="80"/>
+      </w:pPr>
+      <w:r>
+        <w:rPr>
+          <w:rFonts w:ascii="Arial" w:hAnsi="Arial"/>
+          <w:color w:val="2C2C2C"/>
+          <w:sz w:val="20"/>
+        </w:rPr>
+        <w:t>•  Medikamentenmanagement</w:t>
+      </w:r>
+    </w:p>
+    <w:p>
+      <w:pPr>
+        <w:spacing w:after="80"/>
+      </w:pPr>
+      <w:r>
+        <w:rPr>
+          <w:rFonts w:ascii="Arial" w:hAnsi="Arial"/>
+          <w:color w:val="2C2C2C"/>
+          <w:sz w:val="20"/>
+        </w:rPr>
+        <w:t>•  Vitalzeichenüberwachung und Monitoring</w:t>
+      </w:r>
+    </w:p>
+    <w:p>
+      <w:pPr>
+        <w:keepNext/>
+        <w:spacing w:before="240" w:after="80"/>
+      </w:pPr>
+      <w:r>
+        <w:rPr>
+          <w:rFonts w:ascii="Georgia" w:hAnsi="Georgia"/>
+          <w:b/>
+          <w:color w:val="4C2B73"/>
+          <w:sz w:val="21"/>
+        </w:rPr>
+        <w:t>SPEZIELLE THERAPIEN</w:t>
+      </w:r>
+    </w:p>
+    <w:p>
+      <w:pPr>
+        <w:spacing w:after="80"/>
+      </w:pPr>
+      <w:r>
+        <w:rPr>
+          <w:rFonts w:ascii="Arial" w:hAnsi="Arial"/>
+          <w:color w:val="2C2C2C"/>
+          <w:sz w:val="20"/>
+        </w:rPr>
+        <w:t>•  Invasive und nicht-invasive Beatmung</w:t>
+      </w:r>
+    </w:p>
+    <w:p>
+      <w:pPr>
+        <w:spacing w:after="80"/>
+      </w:pPr>
+      <w:r>
+        <w:rPr>
+          <w:rFonts w:ascii="Arial" w:hAnsi="Arial"/>
+          <w:color w:val="2C2C2C"/>
+          <w:sz w:val="20"/>
+        </w:rPr>
+        <w:t>•  Trachealkanülenmanagement</w:t>
+      </w:r>
+    </w:p>
+    <w:p>
+      <w:pPr>
+        <w:spacing w:after="80"/>
+      </w:pPr>
+      <w:r>
+        <w:rPr>
+          <w:rFonts w:ascii="Arial" w:hAnsi="Arial"/>
+          <w:color w:val="2C2C2C"/>
+          <w:sz w:val="20"/>
+        </w:rPr>
+        <w:t>•  Wundversorgung und Ernährungstherapie</w:t>
+      </w:r>
+    </w:p>
+    <w:p>
+      <w:pPr>
+        <w:keepNext/>
+        <w:spacing w:before="240" w:after="80"/>
+      </w:pPr>
+      <w:r>
+        <w:rPr>
+          <w:rFonts w:ascii="Georgia" w:hAnsi="Georgia"/>
+          <w:b/>
+          <w:color w:val="4C2B73"/>
+          <w:sz w:val="21"/>
+        </w:rPr>
+        <w:t>ORGANISATION</w:t>
+      </w:r>
+    </w:p>
+    <w:p>
+      <w:pPr>
+        <w:spacing w:after="80"/>
+      </w:pPr>
+      <w:r>
+        <w:rPr>
+          <w:rFonts w:ascii="Arial" w:hAnsi="Arial"/>
+          <w:color w:val="2C2C2C"/>
+          <w:sz w:val="20"/>
+        </w:rPr>
+        <w:t>•  Pflegeplanung und Dokumentation</w:t>
+      </w:r>
+    </w:p>
+    <w:p>
+      <w:pPr>
+        <w:spacing w:after="80"/>
+      </w:pPr>
+      <w:r>
+        <w:rPr>
+          <w:rFonts w:ascii="Arial" w:hAnsi="Arial"/>
+          <w:color w:val="2C2C2C"/>
+          <w:sz w:val="20"/>
+        </w:rPr>
+        <w:t>•  Koordination mit Ärzten und Therapeuten</w:t>
+      </w:r>
+    </w:p>
+    <w:p>
+      <w:pPr>
+        <w:spacing w:after="120"/>
+      </w:pPr>
+      <w:r>
+        <w:rPr>
+          <w:rFonts w:ascii="Arial" w:hAnsi="Arial"/>
+          <w:i/>
+          <w:color w:val="6E6E6E"/>
+          <w:sz w:val="19"/>
+        </w:rPr>
+        <w:t>Die Beatmungspflege ist unsere Kernkompetenz. Wir betreuen Patienten mit invasiver und nicht-invasiver Beatmung — mit erfahrenen Fachkräften, modernster Technik und in enger Zusammenarbeit mit Pneumologen und Anästhesisten.</w:t>
       </w:r>
     </w:p>
     <w:p>
@@ -967,7 +829,7 @@
           <w:color w:val="4C2B73"/>
           <w:sz w:val="26"/>
         </w:rPr>
-        <w:t>Welche Patienten wir versorgen</w:t>
+        <w:t>Wen wir versorgen</w:t>
       </w:r>
     </w:p>
     <w:p>
@@ -1067,7 +929,7 @@
           <w:color w:val="2C2C2C"/>
           <w:sz w:val="20"/>
         </w:rPr>
-        <w:t>Professionelle Unterstützung и Pflege für Menschen mit Rückenmarksverletzungen. Wir fördern die Selbstständigkeit и beugen gezielt Komplikationen vor.</w:t>
+        <w:t>Professionelle Unterstützung und Pflege für Menschen mit Rückenmarksverletzungen. Wir fördern die Selbstständigkeit und beugen gezielt Komplikationen vor.</w:t>
       </w:r>
     </w:p>
     <w:p>
@@ -1092,7 +954,7 @@
           <w:color w:val="2C2C2C"/>
           <w:sz w:val="20"/>
         </w:rPr>
-        <w:t>Langfristige Versorgung nach schweren Hirnverletzungen. Zielgerichtet auf die Stabilisierung des Zustands и Unterstützung im Alltag.</w:t>
+        <w:t>Langfristige Versorgung nach schweren Hirnverletzungen. Zielgerichtet auf die Stabilisierung des Zustands und Unterstützung im Alltag.</w:t>
       </w:r>
     </w:p>
     <w:p>
@@ -1107,119 +969,7 @@
           <w:color w:val="4C2B73"/>
           <w:sz w:val="26"/>
         </w:rPr>
-        <w:t>Was Sie erwartet</w:t>
-      </w:r>
-    </w:p>
-    <w:p>
-      <w:pPr>
-        <w:spacing w:after="160"/>
-      </w:pPr>
-      <w:r>
-        <w:rPr>
-          <w:rFonts w:ascii="Arial" w:hAnsi="Arial"/>
-          <w:b/>
-          <w:color w:val="2C2C2C"/>
-          <w:sz w:val="20"/>
-        </w:rPr>
-        <w:t>Eigenes Zimmer mit eigenen Möbeln</w:t>
-      </w:r>
-    </w:p>
-    <w:p>
-      <w:pPr>
-        <w:spacing w:after="160"/>
-      </w:pPr>
-      <w:r>
-        <w:rPr>
-          <w:rFonts w:ascii="Arial" w:hAnsi="Arial"/>
-          <w:b/>
-          <w:color w:val="2C2C2C"/>
-          <w:sz w:val="20"/>
-        </w:rPr>
-        <w:t>Alle medizinischen Geräte</w:t>
-      </w:r>
-    </w:p>
-    <w:p>
-      <w:pPr>
-        <w:spacing w:after="160"/>
-      </w:pPr>
-      <w:r>
-        <w:rPr>
-          <w:rFonts w:ascii="Arial" w:hAnsi="Arial"/>
-          <w:b/>
-          <w:color w:val="2C2C2C"/>
-          <w:sz w:val="20"/>
-        </w:rPr>
-        <w:t>Großzügiger Garten</w:t>
-      </w:r>
-    </w:p>
-    <w:p>
-      <w:pPr>
-        <w:spacing w:after="160"/>
-      </w:pPr>
-      <w:r>
-        <w:rPr>
-          <w:rFonts w:ascii="Arial" w:hAnsi="Arial"/>
-          <w:b/>
-          <w:color w:val="2C2C2C"/>
-          <w:sz w:val="20"/>
-        </w:rPr>
-        <w:t>Bibliothek und Gemeinschaftsräume</w:t>
-      </w:r>
-    </w:p>
-    <w:p>
-      <w:pPr>
-        <w:spacing w:after="160"/>
-      </w:pPr>
-      <w:r>
-        <w:rPr>
-          <w:rFonts w:ascii="Arial" w:hAnsi="Arial"/>
-          <w:b/>
-          <w:color w:val="2C2C2C"/>
-          <w:sz w:val="20"/>
-        </w:rPr>
-        <w:t>5,5 Mitarbeiter pro Patient</w:t>
-      </w:r>
-    </w:p>
-    <w:p>
-      <w:pPr>
-        <w:spacing w:after="160"/>
-      </w:pPr>
-      <w:r>
-        <w:rPr>
-          <w:rFonts w:ascii="Arial" w:hAnsi="Arial"/>
-          <w:b/>
-          <w:color w:val="2C2C2C"/>
-          <w:sz w:val="20"/>
-        </w:rPr>
-        <w:t>24h-Betreuung rund um die Uhr</w:t>
-      </w:r>
-    </w:p>
-    <w:p>
-      <w:pPr>
-        <w:spacing w:after="160"/>
-      </w:pPr>
-      <w:r>
-        <w:rPr>
-          <w:rFonts w:ascii="Arial" w:hAnsi="Arial"/>
-          <w:b/>
-          <w:color w:val="2C2C2C"/>
-          <w:sz w:val="20"/>
-        </w:rPr>
-        <w:t>Pflegerische und ärztliche Leistungen</w:t>
-      </w:r>
-    </w:p>
-    <w:p>
-      <w:pPr>
-        <w:spacing w:after="160"/>
-      </w:pPr>
-      <w:r>
-        <w:rPr>
-          <w:rFonts w:ascii="Arial" w:hAnsi="Arial"/>
-          <w:b/>
-          <w:color w:val="2C2C2C"/>
-          <w:sz w:val="20"/>
-        </w:rPr>
-        <w:t>Individuelle Tagesgestaltung</w:t>
+        <w:t>Aufenthaltskonzept Kassel</w:t>
       </w:r>
     </w:p>
     <w:p>
@@ -1232,7 +982,111 @@
           <w:color w:val="2C2C2C"/>
           <w:sz w:val="20"/>
         </w:rPr>
-        <w:t>An der Sommerbergstraße 14 in Kassel bieten wir Patienten ein eigenes Zimmer mit 24h-Betreuung.</w:t>
+        <w:t>An der Sommerbergstraße 14 in Kassel bieten wir Patienten eigene Zimmer mit 24-Stunden-Betreuung.</w:t>
+      </w:r>
+    </w:p>
+    <w:p>
+      <w:pPr>
+        <w:spacing w:after="80"/>
+      </w:pPr>
+      <w:r>
+        <w:rPr>
+          <w:rFonts w:ascii="Arial" w:hAnsi="Arial"/>
+          <w:color w:val="2C2C2C"/>
+          <w:sz w:val="20"/>
+        </w:rPr>
+        <w:t>•  Eigenes Zimmer mit eigenen Möbeln</w:t>
+      </w:r>
+    </w:p>
+    <w:p>
+      <w:pPr>
+        <w:spacing w:after="80"/>
+      </w:pPr>
+      <w:r>
+        <w:rPr>
+          <w:rFonts w:ascii="Arial" w:hAnsi="Arial"/>
+          <w:color w:val="2C2C2C"/>
+          <w:sz w:val="20"/>
+        </w:rPr>
+        <w:t>•  Alle notwendigen medizinischen Geräte</w:t>
+      </w:r>
+    </w:p>
+    <w:p>
+      <w:pPr>
+        <w:spacing w:after="80"/>
+      </w:pPr>
+      <w:r>
+        <w:rPr>
+          <w:rFonts w:ascii="Arial" w:hAnsi="Arial"/>
+          <w:color w:val="2C2C2C"/>
+          <w:sz w:val="20"/>
+        </w:rPr>
+        <w:t>•  Großzügiger Garten</w:t>
+      </w:r>
+    </w:p>
+    <w:p>
+      <w:pPr>
+        <w:spacing w:after="80"/>
+      </w:pPr>
+      <w:r>
+        <w:rPr>
+          <w:rFonts w:ascii="Arial" w:hAnsi="Arial"/>
+          <w:color w:val="2C2C2C"/>
+          <w:sz w:val="20"/>
+        </w:rPr>
+        <w:t>•  Bibliothek und Gemeinschaftsräume</w:t>
+      </w:r>
+    </w:p>
+    <w:p>
+      <w:pPr>
+        <w:spacing w:after="80"/>
+      </w:pPr>
+      <w:r>
+        <w:rPr>
+          <w:rFonts w:ascii="Arial" w:hAnsi="Arial"/>
+          <w:color w:val="2C2C2C"/>
+          <w:sz w:val="20"/>
+        </w:rPr>
+        <w:t>•  5,5 Mitarbeiter pro Patient</w:t>
+      </w:r>
+    </w:p>
+    <w:p>
+      <w:pPr>
+        <w:spacing w:after="80"/>
+      </w:pPr>
+      <w:r>
+        <w:rPr>
+          <w:rFonts w:ascii="Arial" w:hAnsi="Arial"/>
+          <w:color w:val="2C2C2C"/>
+          <w:sz w:val="20"/>
+        </w:rPr>
+        <w:t>•  24h Betreuung und Überwachung</w:t>
+      </w:r>
+    </w:p>
+    <w:p>
+      <w:pPr>
+        <w:spacing w:after="80"/>
+      </w:pPr>
+      <w:r>
+        <w:rPr>
+          <w:rFonts w:ascii="Arial" w:hAnsi="Arial"/>
+          <w:color w:val="2C2C2C"/>
+          <w:sz w:val="20"/>
+        </w:rPr>
+        <w:t>•  Umfassende pflegerische und medizinische Leistungen</w:t>
+      </w:r>
+    </w:p>
+    <w:p>
+      <w:pPr>
+        <w:spacing w:after="80"/>
+      </w:pPr>
+      <w:r>
+        <w:rPr>
+          <w:rFonts w:ascii="Arial" w:hAnsi="Arial"/>
+          <w:color w:val="2C2C2C"/>
+          <w:sz w:val="20"/>
+        </w:rPr>
+        <w:t>•  Individuell gestalteter Tagesablauf</w:t>
       </w:r>
     </w:p>
     <w:p>
@@ -1247,7 +1101,20 @@
           <w:color w:val="4C2B73"/>
           <w:sz w:val="26"/>
         </w:rPr>
-        <w:t>8 Schulungsbereiche</w:t>
+        <w:t>8 Fachbereiche der Schulung</w:t>
+      </w:r>
+    </w:p>
+    <w:p>
+      <w:pPr>
+        <w:spacing w:after="120"/>
+      </w:pPr>
+      <w:r>
+        <w:rPr>
+          <w:rFonts w:ascii="Arial" w:hAnsi="Arial"/>
+          <w:color w:val="2C2C2C"/>
+          <w:sz w:val="20"/>
+        </w:rPr>
+        <w:t>Regelmäßig durchgeführt unter Leitung von Fachärzten für Pneumologie, Kardiologie und Anästhesiologie.</w:t>
       </w:r>
     </w:p>
     <w:p>
@@ -1272,7 +1139,7 @@
           <w:color w:val="2C2C2C"/>
           <w:sz w:val="20"/>
         </w:rPr>
-        <w:t>Desinfektion, Sterilisation, Schutzverhalten, Schutzimpfungen.</w:t>
+        <w:t>Desinfektion, Sterilisation, Schutzmaßnahmen und Impfungen.</w:t>
       </w:r>
     </w:p>
     <w:p>
@@ -1297,7 +1164,7 @@
           <w:color w:val="2C2C2C"/>
           <w:sz w:val="20"/>
         </w:rPr>
-        <w:t>Atemstörungen, Beatmungsverfahren, Intubation, Medikation.</w:t>
+        <w:t>Respiratorische Störungen, Beatmungstechniken, Intubation, Medikamente.</w:t>
       </w:r>
     </w:p>
     <w:p>
@@ -1322,7 +1189,7 @@
           <w:color w:val="2C2C2C"/>
           <w:sz w:val="20"/>
         </w:rPr>
-        <w:t>Herzinsuffizienz, Reanimation, Defibrillator, Medikation.</w:t>
+        <w:t>Herzinsuffizienz, Reanimation, Defibrillation, Medikation.</w:t>
       </w:r>
     </w:p>
     <w:p>
@@ -1336,7 +1203,7 @@
           <w:color w:val="2C2C2C"/>
           <w:sz w:val="20"/>
         </w:rPr>
-        <w:t>Schock</w:t>
+        <w:t>Schockgeschehen</w:t>
       </w:r>
       <w:r>
         <w:br/>
@@ -1372,7 +1239,7 @@
           <w:color w:val="2C2C2C"/>
           <w:sz w:val="20"/>
         </w:rPr>
-        <w:t>Tracheotomie, Pleura-Punktion, PEEP-Beatmung, Druckinfusion.</w:t>
+        <w:t>Tracheotomie, Pleurapunktion, PEEP-Beatmung, Druckinfusion.</w:t>
       </w:r>
     </w:p>
     <w:p>
@@ -1397,7 +1264,7 @@
           <w:color w:val="2C2C2C"/>
           <w:sz w:val="20"/>
         </w:rPr>
-        <w:t>Schädel-/Gehirnverletzungen, Blutungen, Erstversorgung.</w:t>
+        <w:t>Schädel-Hirn-Verletzungen, Blutungen, Erstversorgung.</w:t>
       </w:r>
     </w:p>
     <w:p>
@@ -1447,20 +1314,7 @@
           <w:color w:val="2C2C2C"/>
           <w:sz w:val="20"/>
         </w:rPr>
-        <w:t>Hitzeschäden, Kälteschäden, Verbrennung, Inhalationstrauma.</w:t>
-      </w:r>
-    </w:p>
-    <w:p>
-      <w:pPr>
-        <w:spacing w:after="120"/>
-      </w:pPr>
-      <w:r>
-        <w:rPr>
-          <w:rFonts w:ascii="Arial" w:hAnsi="Arial"/>
-          <w:color w:val="2C2C2C"/>
-          <w:sz w:val="20"/>
-        </w:rPr>
-        <w:t>Regelmäßig geleitet von Fachärzten, Pulmologen, Kardiologen und Anästhesisten.</w:t>
+        <w:t>Hitze- und Kälteschäden, Verbrennungen, Inhalationstrauma.</w:t>
       </w:r>
     </w:p>
     <w:p>
@@ -1475,7 +1329,20 @@
           <w:color w:val="4C2B73"/>
           <w:sz w:val="26"/>
         </w:rPr>
-        <w:t>Kostenübernahme</w:t>
+        <w:t>Wer die Kosten trägt</w:t>
+      </w:r>
+    </w:p>
+    <w:p>
+      <w:pPr>
+        <w:spacing w:after="120"/>
+      </w:pPr>
+      <w:r>
+        <w:rPr>
+          <w:rFonts w:ascii="Arial" w:hAnsi="Arial"/>
+          <w:color w:val="2C2C2C"/>
+          <w:sz w:val="20"/>
+        </w:rPr>
+        <w:t>Erfahrene Mitarbeiter vom Intensivpflegedienst KSK Farmos GmbH &amp; Co. KG übernehmen nach Erhalt einer Vollmacht die Verhandlungen mit den Kostenträgern bezüglich der Finanzierung einer 24-stündigen Intensiv-Versorgung. Diese sind in der Regel:</w:t>
       </w:r>
     </w:p>
     <w:p>
@@ -1579,32 +1446,6 @@
       </w:r>
     </w:p>
     <w:p>
-      <w:pPr>
-        <w:spacing w:after="120"/>
-      </w:pPr>
-      <w:r>
-        <w:rPr>
-          <w:rFonts w:ascii="Arial" w:hAnsi="Arial"/>
-          <w:color w:val="2C2C2C"/>
-          <w:sz w:val="20"/>
-        </w:rPr>
-        <w:t>Erfahrene Mitarbeiter vom Intensivpflegedienst KSK Farmos GmbH &amp; Co. KG übernehmen nach Erhalt einer Vollmacht die Verhandlungen mit den Kostenträgern bezüglich der Finanzierung einer 24-stündigen Intensiv-Versorgung. Diese sind in der Regel:</w:t>
-      </w:r>
-    </w:p>
-    <w:p>
-      <w:pPr>
-        <w:spacing w:after="120"/>
-      </w:pPr>
-      <w:r>
-        <w:rPr>
-          <w:rFonts w:ascii="Arial" w:hAnsi="Arial"/>
-          <w:color w:val="2C2C2C"/>
-          <w:sz w:val="20"/>
-        </w:rPr>
-        <w:t>Wir beraten Sie persönlich — unverbindlich und kostenfrei.</w:t>
-      </w:r>
-    </w:p>
-    <w:p>
       <w:r>
         <w:br w:type="page"/>
       </w:r>
@@ -1677,7 +1518,7 @@
           <w:color w:val="4C2B73"/>
           <w:sz w:val="26"/>
         </w:rPr>
-        <w:t>Gegründet aus Überzeugung</w:t>
+        <w:t>Unsere Geschichte — Gegründet aus Überzeugung</w:t>
       </w:r>
     </w:p>
     <w:p>
@@ -1718,13 +1559,25 @@
           <w:color w:val="4C2B73"/>
           <w:sz w:val="26"/>
         </w:rPr>
-        <w:t>Woran wir uns orientieren</w:t>
+        <w:t>Unser Leitbild — Woran wir uns orientieren</w:t>
       </w:r>
     </w:p>
     <w:p>
       <w:pPr>
-        <w:spacing w:after="120"/>
-      </w:pPr>
+        <w:spacing w:after="160"/>
+      </w:pPr>
+      <w:r>
+        <w:rPr>
+          <w:rFonts w:ascii="Arial" w:hAnsi="Arial"/>
+          <w:b/>
+          <w:color w:val="2C2C2C"/>
+          <w:sz w:val="20"/>
+        </w:rPr>
+        <w:t>Lebensprozesse unterstützen</w:t>
+      </w:r>
+      <w:r>
+        <w:br/>
+      </w:r>
       <w:r>
         <w:rPr>
           <w:rFonts w:ascii="Arial" w:hAnsi="Arial"/>
@@ -1736,8 +1589,20 @@
     </w:p>
     <w:p>
       <w:pPr>
-        <w:spacing w:after="120"/>
-      </w:pPr>
+        <w:spacing w:after="160"/>
+      </w:pPr>
+      <w:r>
+        <w:rPr>
+          <w:rFonts w:ascii="Arial" w:hAnsi="Arial"/>
+          <w:b/>
+          <w:color w:val="2C2C2C"/>
+          <w:sz w:val="20"/>
+        </w:rPr>
+        <w:t>Körperfunktionen fördern</w:t>
+      </w:r>
+      <w:r>
+        <w:br/>
+      </w:r>
       <w:r>
         <w:rPr>
           <w:rFonts w:ascii="Arial" w:hAnsi="Arial"/>
@@ -1749,8 +1614,20 @@
     </w:p>
     <w:p>
       <w:pPr>
-        <w:spacing w:after="120"/>
-      </w:pPr>
+        <w:spacing w:after="160"/>
+      </w:pPr>
+      <w:r>
+        <w:rPr>
+          <w:rFonts w:ascii="Arial" w:hAnsi="Arial"/>
+          <w:b/>
+          <w:color w:val="2C2C2C"/>
+          <w:sz w:val="20"/>
+        </w:rPr>
+        <w:t>Krankheit kontrollieren</w:t>
+      </w:r>
+      <w:r>
+        <w:br/>
+      </w:r>
       <w:r>
         <w:rPr>
           <w:rFonts w:ascii="Arial" w:hAnsi="Arial"/>
@@ -1762,8 +1639,20 @@
     </w:p>
     <w:p>
       <w:pPr>
-        <w:spacing w:after="120"/>
-      </w:pPr>
+        <w:spacing w:after="160"/>
+      </w:pPr>
+      <w:r>
+        <w:rPr>
+          <w:rFonts w:ascii="Arial" w:hAnsi="Arial"/>
+          <w:b/>
+          <w:color w:val="2C2C2C"/>
+          <w:sz w:val="20"/>
+        </w:rPr>
+        <w:t>Wohlbefinden fördern</w:t>
+      </w:r>
+      <w:r>
+        <w:br/>
+      </w:r>
       <w:r>
         <w:rPr>
           <w:rFonts w:ascii="Arial" w:hAnsi="Arial"/>
@@ -1775,8 +1664,20 @@
     </w:p>
     <w:p>
       <w:pPr>
-        <w:spacing w:after="120"/>
-      </w:pPr>
+        <w:spacing w:after="160"/>
+      </w:pPr>
+      <w:r>
+        <w:rPr>
+          <w:rFonts w:ascii="Arial" w:hAnsi="Arial"/>
+          <w:b/>
+          <w:color w:val="2C2C2C"/>
+          <w:sz w:val="20"/>
+        </w:rPr>
+        <w:t>Komplikationen verhindern</w:t>
+      </w:r>
+      <w:r>
+        <w:br/>
+      </w:r>
       <w:r>
         <w:rPr>
           <w:rFonts w:ascii="Arial" w:hAnsi="Arial"/>
@@ -1812,7 +1713,7 @@
           <w:color w:val="2C2C2C"/>
           <w:sz w:val="20"/>
         </w:rPr>
-        <w:t>Olga Korp</w:t>
+        <w:t>Pflegedienstleitung (PDL)</w:t>
       </w:r>
       <w:r>
         <w:br/>
@@ -1823,7 +1724,7 @@
           <w:color w:val="2C2C2C"/>
           <w:sz w:val="20"/>
         </w:rPr>
-        <w:t>Pflegedienstleitung (PDL)</w:t>
+        <w:t>Verantwortlich für die fachliche Leitung und Qualitätssicherung aller Pflegemaßnahmen.</w:t>
       </w:r>
     </w:p>
     <w:p>
@@ -1837,7 +1738,7 @@
           <w:color w:val="2C2C2C"/>
           <w:sz w:val="20"/>
         </w:rPr>
-        <w:t>Lidia Zimmermann</w:t>
+        <w:t>Stellv. Pflegedienstleitung</w:t>
       </w:r>
       <w:r>
         <w:br/>
@@ -1848,7 +1749,7 @@
           <w:color w:val="2C2C2C"/>
           <w:sz w:val="20"/>
         </w:rPr>
-        <w:t>Stellv. Pflegedienstleitung</w:t>
+        <w:t>Koordination der Pflegeteams und direkte Ansprechpartnerin für Angehörige.</w:t>
       </w:r>
     </w:p>
     <w:p>
@@ -1873,7 +1774,7 @@
           <w:color w:val="2C2C2C"/>
           <w:sz w:val="20"/>
         </w:rPr>
-        <w:t>Examinierte Fachkräfte mit Erfahrung in der Intensivpflege.</w:t>
+        <w:t>Rund 30 Mitarbeiter — qualifiziert, empathisch und zuverlässig im Einsatz.</w:t>
       </w:r>
     </w:p>
     <w:p>
@@ -1888,96 +1789,12 @@
           <w:color w:val="4C2B73"/>
           <w:sz w:val="26"/>
         </w:rPr>
-        <w:t>Unsere Partner</w:t>
+        <w:t>Unsere Partner &amp; Kooperationen</w:t>
       </w:r>
     </w:p>
     <w:p>
       <w:pPr>
-        <w:spacing w:after="160"/>
-      </w:pPr>
-      <w:r>
-        <w:rPr>
-          <w:rFonts w:ascii="Arial" w:hAnsi="Arial"/>
-          <w:b/>
-          <w:color w:val="2C2C2C"/>
-          <w:sz w:val="20"/>
-        </w:rPr>
-        <w:t>Haus- und Fachärzte in ganz Hessen</w:t>
-      </w:r>
-    </w:p>
-    <w:p>
-      <w:pPr>
-        <w:spacing w:after="160"/>
-      </w:pPr>
-      <w:r>
-        <w:rPr>
-          <w:rFonts w:ascii="Arial" w:hAnsi="Arial"/>
-          <w:b/>
-          <w:color w:val="2C2C2C"/>
-          <w:sz w:val="20"/>
-        </w:rPr>
-        <w:t>Physiotherapeuten</w:t>
-      </w:r>
-    </w:p>
-    <w:p>
-      <w:pPr>
-        <w:spacing w:after="160"/>
-      </w:pPr>
-      <w:r>
-        <w:rPr>
-          <w:rFonts w:ascii="Arial" w:hAnsi="Arial"/>
-          <w:b/>
-          <w:color w:val="2C2C2C"/>
-          <w:sz w:val="20"/>
-        </w:rPr>
-        <w:t>Logopäden</w:t>
-      </w:r>
-    </w:p>
-    <w:p>
-      <w:pPr>
-        <w:spacing w:after="160"/>
-      </w:pPr>
-      <w:r>
-        <w:rPr>
-          <w:rFonts w:ascii="Arial" w:hAnsi="Arial"/>
-          <w:b/>
-          <w:color w:val="2C2C2C"/>
-          <w:sz w:val="20"/>
-        </w:rPr>
-        <w:t>Ergotherapeuten</w:t>
-      </w:r>
-    </w:p>
-    <w:p>
-      <w:pPr>
-        <w:spacing w:after="160"/>
-      </w:pPr>
-      <w:r>
-        <w:rPr>
-          <w:rFonts w:ascii="Arial" w:hAnsi="Arial"/>
-          <w:b/>
-          <w:color w:val="2C2C2C"/>
-          <w:sz w:val="20"/>
-        </w:rPr>
-        <w:t>Medizintechniker</w:t>
-      </w:r>
-    </w:p>
-    <w:p>
-      <w:pPr>
-        <w:spacing w:after="160"/>
-      </w:pPr>
-      <w:r>
-        <w:rPr>
-          <w:rFonts w:ascii="Arial" w:hAnsi="Arial"/>
-          <w:b/>
-          <w:color w:val="2C2C2C"/>
-          <w:sz w:val="20"/>
-        </w:rPr>
-        <w:t>Kranken-, Pflege- und Sozialkassen</w:t>
-      </w:r>
-    </w:p>
-    <w:p>
-      <w:pPr>
-        <w:spacing w:after="120"/>
+        <w:spacing w:after="80"/>
       </w:pPr>
       <w:r>
         <w:rPr>
@@ -1985,7 +1802,113 @@
           <w:color w:val="2C2C2C"/>
           <w:sz w:val="20"/>
         </w:rPr>
-        <w:t>Wir beraten Sie persönlich — unverbindlich und kostenfrei.</w:t>
+        <w:t>•  Haus- und Fachärzte in ganz Hessen</w:t>
+      </w:r>
+    </w:p>
+    <w:p>
+      <w:pPr>
+        <w:spacing w:after="80"/>
+      </w:pPr>
+      <w:r>
+        <w:rPr>
+          <w:rFonts w:ascii="Arial" w:hAnsi="Arial"/>
+          <w:color w:val="2C2C2C"/>
+          <w:sz w:val="20"/>
+        </w:rPr>
+        <w:t>•  Physiotherapeuten</w:t>
+      </w:r>
+    </w:p>
+    <w:p>
+      <w:pPr>
+        <w:spacing w:after="80"/>
+      </w:pPr>
+      <w:r>
+        <w:rPr>
+          <w:rFonts w:ascii="Arial" w:hAnsi="Arial"/>
+          <w:color w:val="2C2C2C"/>
+          <w:sz w:val="20"/>
+        </w:rPr>
+        <w:t>•  Logopäden</w:t>
+      </w:r>
+    </w:p>
+    <w:p>
+      <w:pPr>
+        <w:spacing w:after="80"/>
+      </w:pPr>
+      <w:r>
+        <w:rPr>
+          <w:rFonts w:ascii="Arial" w:hAnsi="Arial"/>
+          <w:color w:val="2C2C2C"/>
+          <w:sz w:val="20"/>
+        </w:rPr>
+        <w:t>•  Ergotherapeuten</w:t>
+      </w:r>
+    </w:p>
+    <w:p>
+      <w:pPr>
+        <w:spacing w:after="80"/>
+      </w:pPr>
+      <w:r>
+        <w:rPr>
+          <w:rFonts w:ascii="Arial" w:hAnsi="Arial"/>
+          <w:color w:val="2C2C2C"/>
+          <w:sz w:val="20"/>
+        </w:rPr>
+        <w:t>•  Medizintechniker</w:t>
+      </w:r>
+    </w:p>
+    <w:p>
+      <w:pPr>
+        <w:spacing w:after="80"/>
+      </w:pPr>
+      <w:r>
+        <w:rPr>
+          <w:rFonts w:ascii="Arial" w:hAnsi="Arial"/>
+          <w:color w:val="2C2C2C"/>
+          <w:sz w:val="20"/>
+        </w:rPr>
+        <w:t>•  Kranken-, Pflege- und Sozialkassen</w:t>
+      </w:r>
+    </w:p>
+    <w:p>
+      <w:pPr>
+        <w:keepNext/>
+        <w:spacing w:before="280" w:after="160"/>
+      </w:pPr>
+      <w:r>
+        <w:rPr>
+          <w:rFonts w:ascii="Georgia" w:hAnsi="Georgia"/>
+          <w:b/>
+          <w:color w:val="4C2B73"/>
+          <w:sz w:val="26"/>
+        </w:rPr>
+        <w:t>Unsere Standorte</w:t>
+      </w:r>
+    </w:p>
+    <w:p>
+      <w:pPr>
+        <w:spacing w:after="80"/>
+      </w:pPr>
+      <w:r>
+        <w:rPr>
+          <w:rFonts w:ascii="Arial" w:hAnsi="Arial"/>
+          <w:color w:val="2C2C2C"/>
+          <w:sz w:val="20"/>
+        </w:rPr>
+        <w:t>•  Hauptzentrale Volkmarsen</w:t>
+      </w:r>
+    </w:p>
+    <w:p>
+      <w:pPr>
+        <w:spacing w:after="80"/>
+      </w:pPr>
+      <w:r>
+        <w:rPr>
+          <w:rFonts w:ascii="Arial" w:hAnsi="Arial"/>
+          <w:color w:val="2C2C2C"/>
+          <w:sz w:val="20"/>
+        </w:rPr>
+        <w:t>•  Aufenthaltskonzept Kassel</w:t>
       </w:r>
     </w:p>
     <w:p>
@@ -2033,7 +1956,7 @@
           <w:color w:val="4C2B73"/>
           <w:sz w:val="26"/>
         </w:rPr>
-        <w:t>Arbeiten, wo es wirklich zählt.</w:t>
+        <w:t>Arbeiten wo es zählt.</w:t>
       </w:r>
     </w:p>
     <w:p>
@@ -2047,6 +1970,60 @@
           <w:sz w:val="20"/>
         </w:rPr>
         <w:t>Übertarifliche Bezahlung, kontinuierliche Weiterbildung und ein Team, das zusammenhält.</w:t>
+      </w:r>
+    </w:p>
+    <w:p>
+      <w:pPr>
+        <w:keepNext/>
+        <w:spacing w:before="280" w:after="160"/>
+      </w:pPr>
+      <w:r>
+        <w:rPr>
+          <w:rFonts w:ascii="Georgia" w:hAnsi="Georgia"/>
+          <w:b/>
+          <w:color w:val="4C2B73"/>
+          <w:sz w:val="26"/>
+        </w:rPr>
+        <w:t>Offene Stellen</w:t>
+      </w:r>
+    </w:p>
+    <w:p>
+      <w:pPr>
+        <w:spacing w:after="80"/>
+      </w:pPr>
+      <w:r>
+        <w:rPr>
+          <w:rFonts w:ascii="Arial" w:hAnsi="Arial"/>
+          <w:color w:val="2C2C2C"/>
+          <w:sz w:val="20"/>
+        </w:rPr>
+        <w:t>•  Examinierte Pflegefachkraft (w/m/d)</w:t>
+      </w:r>
+    </w:p>
+    <w:p>
+      <w:pPr>
+        <w:spacing w:after="80"/>
+      </w:pPr>
+      <w:r>
+        <w:rPr>
+          <w:rFonts w:ascii="Arial" w:hAnsi="Arial"/>
+          <w:color w:val="2C2C2C"/>
+          <w:sz w:val="20"/>
+        </w:rPr>
+        <w:t>•  Pflegekraft / Altenpfleger (w/m/d)</w:t>
+      </w:r>
+    </w:p>
+    <w:p>
+      <w:pPr>
+        <w:spacing w:after="80"/>
+      </w:pPr>
+      <w:r>
+        <w:rPr>
+          <w:rFonts w:ascii="Arial" w:hAnsi="Arial"/>
+          <w:color w:val="2C2C2C"/>
+          <w:sz w:val="20"/>
+        </w:rPr>
+        <w:t>•  Medizinstudenten — Pflegepraktikum</w:t>
       </w:r>
     </w:p>
     <w:p>
@@ -2226,28 +2203,25 @@
           <w:color w:val="4C2B73"/>
           <w:sz w:val="26"/>
         </w:rPr>
-        <w:t>Offene Stellen</w:t>
+        <w:t>So bewerben Sie sich</w:t>
       </w:r>
     </w:p>
     <w:p>
       <w:pPr>
-        <w:keepNext/>
-        <w:spacing w:before="280" w:after="160"/>
+        <w:spacing w:after="160"/>
       </w:pPr>
       <w:r>
         <w:rPr>
-          <w:rFonts w:ascii="Georgia" w:hAnsi="Georgia"/>
+          <w:rFonts w:ascii="Arial" w:hAnsi="Arial"/>
           <w:b/>
-          <w:color w:val="4C2B73"/>
-          <w:sz w:val="26"/>
+          <w:color w:val="2C2C2C"/>
+          <w:sz w:val="20"/>
         </w:rPr>
-        <w:t>Bewerbung einreichen</w:t>
-      </w:r>
-    </w:p>
-    <w:p>
-      <w:pPr>
-        <w:spacing w:after="120"/>
-      </w:pPr>
+        <w:t>1. Bewerbung einreichen</w:t>
+      </w:r>
+      <w:r>
+        <w:br/>
+      </w:r>
       <w:r>
         <w:rPr>
           <w:rFonts w:ascii="Arial" w:hAnsi="Arial"/>
@@ -2259,19 +2233,6 @@
     </w:p>
     <w:p>
       <w:pPr>
-        <w:spacing w:after="120"/>
-      </w:pPr>
-      <w:r>
-        <w:rPr>
-          <w:rFonts w:ascii="Arial" w:hAnsi="Arial"/>
-          <w:color w:val="2C2C2C"/>
-          <w:sz w:val="20"/>
-        </w:rPr>
-        <w:t>Per Formular, E-Mail oder Telefon.</w:t>
-      </w:r>
-    </w:p>
-    <w:p>
-      <w:pPr>
         <w:spacing w:after="160"/>
       </w:pPr>
       <w:r>
@@ -2281,7 +2242,7 @@
           <w:color w:val="2C2C2C"/>
           <w:sz w:val="20"/>
         </w:rPr>
-        <w:t>Persönliches Gespräch</w:t>
+        <w:t>2. Persönliches Gespräch</w:t>
       </w:r>
       <w:r>
         <w:br/>
@@ -2306,7 +2267,7 @@
           <w:color w:val="2C2C2C"/>
           <w:sz w:val="20"/>
         </w:rPr>
-        <w:t>Willkommen im Team</w:t>
+        <w:t>3. Willkommen im Team</w:t>
       </w:r>
       <w:r>
         <w:br/>
@@ -2318,21 +2279,6 @@
           <w:sz w:val="20"/>
         </w:rPr>
         <w:t>Einarbeitung, Fortbildungen und Unterstützung.</w:t>
-      </w:r>
-    </w:p>
-    <w:p>
-      <w:pPr>
-        <w:keepNext/>
-        <w:spacing w:before="280" w:after="160"/>
-      </w:pPr>
-      <w:r>
-        <w:rPr>
-          <w:rFonts w:ascii="Georgia" w:hAnsi="Georgia"/>
-          <w:b/>
-          <w:color w:val="4C2B73"/>
-          <w:sz w:val="26"/>
-        </w:rPr>
-        <w:t>Bereit für den nächsten Schritt?</w:t>
       </w:r>
     </w:p>
     <w:p>
@@ -2370,19 +2316,6 @@
     </w:p>
     <w:p>
       <w:pPr>
-        <w:spacing w:after="120"/>
-      </w:pPr>
-      <w:r>
-        <w:rPr>
-          <w:rFonts w:ascii="Arial" w:hAnsi="Arial"/>
-          <w:color w:val="2C2C2C"/>
-          <w:sz w:val="20"/>
-        </w:rPr>
-        <w:t>Schnell und unkompliziert — kein Anschreiben nötig.</w:t>
-      </w:r>
-    </w:p>
-    <w:p>
-      <w:pPr>
         <w:keepNext/>
         <w:spacing w:before="280" w:after="160"/>
       </w:pPr>
@@ -2393,7 +2326,20 @@
           <w:color w:val="4C2B73"/>
           <w:sz w:val="26"/>
         </w:rPr>
-        <w:t>Ihr nächster Karriereschritt</w:t>
+        <w:t>In 3 Schritten bewerben</w:t>
+      </w:r>
+    </w:p>
+    <w:p>
+      <w:pPr>
+        <w:spacing w:after="120"/>
+      </w:pPr>
+      <w:r>
+        <w:rPr>
+          <w:rFonts w:ascii="Arial" w:hAnsi="Arial"/>
+          <w:color w:val="2C2C2C"/>
+          <w:sz w:val="20"/>
+        </w:rPr>
+        <w:t>Kein Anschreiben nötig — einfach Kontaktdaten hinterlassen und wir melden uns.</w:t>
       </w:r>
     </w:p>
     <w:p>
@@ -2407,7 +2353,7 @@
           <w:color w:val="2C2C2C"/>
           <w:sz w:val="20"/>
         </w:rPr>
-        <w:t>Persönliche Daten</w:t>
+        <w:t>Schritt 1: Über Sie</w:t>
       </w:r>
       <w:r>
         <w:br/>
@@ -2418,34 +2364,57 @@
           <w:color w:val="2C2C2C"/>
           <w:sz w:val="20"/>
         </w:rPr>
-        <w:t>Ich habe die Datenschutzerklärung gelesen und stimme zu.</w:t>
+        <w:t>Vorname, Nachname, E-Mail, Telefon</w:t>
       </w:r>
     </w:p>
     <w:p>
       <w:pPr>
-        <w:spacing w:after="120"/>
+        <w:spacing w:after="160"/>
       </w:pPr>
       <w:r>
         <w:rPr>
           <w:rFonts w:ascii="Arial" w:hAnsi="Arial"/>
-          <w:i/>
-          <w:color w:val="6E6E6E"/>
-          <w:sz w:val="19"/>
+          <w:b/>
+          <w:color w:val="2C2C2C"/>
+          <w:sz w:val="20"/>
         </w:rPr>
-        <w:t>Kein Anschreiben. Kein Lebenslauf. Einfach ausfüllen — wir melden uns.</w:t>
-      </w:r>
-    </w:p>
-    <w:p>
-      <w:pPr>
-        <w:spacing w:after="120"/>
-      </w:pPr>
+        <w:t>Schritt 2: Qualifikation</w:t>
+      </w:r>
+      <w:r>
+        <w:br/>
+      </w:r>
       <w:r>
         <w:rPr>
           <w:rFonts w:ascii="Arial" w:hAnsi="Arial"/>
           <w:color w:val="2C2C2C"/>
           <w:sz w:val="20"/>
         </w:rPr>
-        <w:t>Kein Anschreiben. Kein Lebenslauf. Einfach ausfüllen — wir melden uns.</w:t>
+        <w:t>Gewünschte Stelle, Arbeitszeit (Vollzeit, Teilzeit, Minijob, Flexibel)</w:t>
+      </w:r>
+    </w:p>
+    <w:p>
+      <w:pPr>
+        <w:spacing w:after="160"/>
+      </w:pPr>
+      <w:r>
+        <w:rPr>
+          <w:rFonts w:ascii="Arial" w:hAnsi="Arial"/>
+          <w:b/>
+          <w:color w:val="2C2C2C"/>
+          <w:sz w:val="20"/>
+        </w:rPr>
+        <w:t>Schritt 3: Fast geschafft</w:t>
+      </w:r>
+      <w:r>
+        <w:br/>
+      </w:r>
+      <w:r>
+        <w:rPr>
+          <w:rFonts w:ascii="Arial" w:hAnsi="Arial"/>
+          <w:color w:val="2C2C2C"/>
+          <w:sz w:val="20"/>
+        </w:rPr>
+        <w:t>Nachricht / Anschreiben (optional), Datenschutzerklärung zustimmen</w:t>
       </w:r>
     </w:p>
     <w:p>
@@ -2493,61 +2462,7 @@
           <w:color w:val="4C2B73"/>
           <w:sz w:val="26"/>
         </w:rPr>
-        <w:t>Häufig gestellte Fragen</w:t>
-      </w:r>
-    </w:p>
-    <w:p>
-      <w:pPr>
-        <w:spacing w:after="120"/>
-      </w:pPr>
-      <w:r>
-        <w:rPr>
-          <w:rFonts w:ascii="Arial" w:hAnsi="Arial"/>
-          <w:color w:val="2C2C2C"/>
-          <w:sz w:val="20"/>
-        </w:rPr>
-        <w:t>Antworten auf die wichtigsten Fragen rund um unsere Intensivpflege.</w:t>
-      </w:r>
-    </w:p>
-    <w:p>
-      <w:pPr>
-        <w:keepNext/>
-        <w:spacing w:before="280" w:after="160"/>
-      </w:pPr>
-      <w:r>
-        <w:rPr>
-          <w:rFonts w:ascii="Georgia" w:hAnsi="Georgia"/>
-          <w:b/>
-          <w:color w:val="4C2B73"/>
-          <w:sz w:val="26"/>
-        </w:rPr>
-        <w:t>Kosten</w:t>
-      </w:r>
-    </w:p>
-    <w:p>
-      <w:pPr>
-        <w:spacing w:after="120"/>
-      </w:pPr>
-      <w:r>
-        <w:rPr>
-          <w:rFonts w:ascii="Arial" w:hAnsi="Arial"/>
-          <w:color w:val="2C2C2C"/>
-          <w:sz w:val="20"/>
-        </w:rPr>
-        <w:t>Die Intensivpflege wird in der Regel vollständig von der Krankenkasse übernommen.</w:t>
-      </w:r>
-    </w:p>
-    <w:p>
-      <w:pPr>
-        <w:spacing w:after="120"/>
-      </w:pPr>
-      <w:r>
-        <w:rPr>
-          <w:rFonts w:ascii="Arial" w:hAnsi="Arial"/>
-          <w:color w:val="2C2C2C"/>
-          <w:sz w:val="20"/>
-        </w:rPr>
-        <w:t>Die Intensivpflege wird in der Regel vollständig von der Krankenkasse übernommen.</w:t>
+        <w:t>Häufig gestellte Fragen rund um unsere Intensivpflege</w:t>
       </w:r>
     </w:p>
     <w:p>
@@ -2561,7 +2476,7 @@
           <w:color w:val="2C2C2C"/>
           <w:sz w:val="20"/>
         </w:rPr>
-        <w:t>Ablauf</w:t>
+        <w:t>Ist eine ambulante Intensivpflege zu Hause wirklich möglich?</w:t>
       </w:r>
       <w:r>
         <w:br/>
@@ -2572,7 +2487,7 @@
           <w:color w:val="2C2C2C"/>
           <w:sz w:val="20"/>
         </w:rPr>
-        <w:t>Vom Erstgespräch bis zum Versorgungsbeginn vergehen ca. 4-6 Wochen.</w:t>
+        <w:t>Ja — in vielen Fällen ist eine vollständige Intensivversorgung in den eigenen vier Wänden möglich. Voraussetzung ist eine ärztliche Verordnung häuslicher Krankenpflege.</w:t>
       </w:r>
     </w:p>
     <w:p>
@@ -2586,37 +2501,11 @@
           <w:color w:val="2C2C2C"/>
           <w:sz w:val="20"/>
         </w:rPr>
-        <w:t>Qualifikation</w:t>
+        <w:t>In welchen Regionen sind Sie tätig?</w:t>
       </w:r>
       <w:r>
         <w:br/>
       </w:r>
-      <w:r>
-        <w:rPr>
-          <w:rFonts w:ascii="Arial" w:hAnsi="Arial"/>
-          <w:color w:val="2C2C2C"/>
-          <w:sz w:val="20"/>
-        </w:rPr>
-        <w:t>Alle Leistungen werden von examinierten, fortgebildeten Fachkräften erbracht.</w:t>
-      </w:r>
-    </w:p>
-    <w:p>
-      <w:pPr>
-        <w:spacing w:after="120"/>
-      </w:pPr>
-      <w:r>
-        <w:rPr>
-          <w:rFonts w:ascii="Arial" w:hAnsi="Arial"/>
-          <w:color w:val="2C2C2C"/>
-          <w:sz w:val="20"/>
-        </w:rPr>
-        <w:t>Ja — in vielen Fällen ist eine vollständige Intensivversorgung in den eigenen vier Wänden möglich. Voraussetzung ist eine ärztliche Verordnung häuslicher Krankenpflege.</w:t>
-      </w:r>
-    </w:p>
-    <w:p>
-      <w:pPr>
-        <w:spacing w:after="120"/>
-      </w:pPr>
       <w:r>
         <w:rPr>
           <w:rFonts w:ascii="Arial" w:hAnsi="Arial"/>
@@ -2628,8 +2517,20 @@
     </w:p>
     <w:p>
       <w:pPr>
-        <w:spacing w:after="120"/>
-      </w:pPr>
+        <w:spacing w:after="160"/>
+      </w:pPr>
+      <w:r>
+        <w:rPr>
+          <w:rFonts w:ascii="Arial" w:hAnsi="Arial"/>
+          <w:b/>
+          <w:color w:val="2C2C2C"/>
+          <w:sz w:val="20"/>
+        </w:rPr>
+        <w:t>Wer übernimmt die Kosten für die Intensivpflege?</w:t>
+      </w:r>
+      <w:r>
+        <w:br/>
+      </w:r>
       <w:r>
         <w:rPr>
           <w:rFonts w:ascii="Arial" w:hAnsi="Arial"/>
@@ -2641,8 +2542,20 @@
     </w:p>
     <w:p>
       <w:pPr>
-        <w:spacing w:after="120"/>
-      </w:pPr>
+        <w:spacing w:after="160"/>
+      </w:pPr>
+      <w:r>
+        <w:rPr>
+          <w:rFonts w:ascii="Arial" w:hAnsi="Arial"/>
+          <w:b/>
+          <w:color w:val="2C2C2C"/>
+          <w:sz w:val="20"/>
+        </w:rPr>
+        <w:t>Spielt die Pflegestufe eine Rolle für die 24h-Versorgung?</w:t>
+      </w:r>
+      <w:r>
+        <w:br/>
+      </w:r>
       <w:r>
         <w:rPr>
           <w:rFonts w:ascii="Arial" w:hAnsi="Arial"/>
@@ -2654,8 +2567,20 @@
     </w:p>
     <w:p>
       <w:pPr>
-        <w:spacing w:after="120"/>
-      </w:pPr>
+        <w:spacing w:after="160"/>
+      </w:pPr>
+      <w:r>
+        <w:rPr>
+          <w:rFonts w:ascii="Arial" w:hAnsi="Arial"/>
+          <w:b/>
+          <w:color w:val="2C2C2C"/>
+          <w:sz w:val="20"/>
+        </w:rPr>
+        <w:t>Wie lange dauert es, bis die Versorgung beginnt?</w:t>
+      </w:r>
+      <w:r>
+        <w:br/>
+      </w:r>
       <w:r>
         <w:rPr>
           <w:rFonts w:ascii="Arial" w:hAnsi="Arial"/>
@@ -2667,21 +2592,45 @@
     </w:p>
     <w:p>
       <w:pPr>
-        <w:spacing w:after="120"/>
-      </w:pPr>
+        <w:spacing w:after="160"/>
+      </w:pPr>
+      <w:r>
+        <w:rPr>
+          <w:rFonts w:ascii="Arial" w:hAnsi="Arial"/>
+          <w:b/>
+          <w:color w:val="2C2C2C"/>
+          <w:sz w:val="20"/>
+        </w:rPr>
+        <w:t>Welche Qualifikationen hat Ihr Pflegepersonal?</w:t>
+      </w:r>
+      <w:r>
+        <w:br/>
+      </w:r>
       <w:r>
         <w:rPr>
           <w:rFonts w:ascii="Arial" w:hAnsi="Arial"/>
           <w:color w:val="2C2C2C"/>
           <w:sz w:val="20"/>
         </w:rPr>
-        <w:t>Alle ärztlich verordneten Leistungen werden von examinierten Pflegefachkräften durchgeführt, die regelmäßig durch Fachärzte fortgebildet werden.</w:t>
+        <w:t>Alle ärztlich verordneten Leistungen werden von examinierten Pflegefachkräften erbracht, die regelmäßig durch Fachärzte fortgebildet werden.</w:t>
       </w:r>
     </w:p>
     <w:p>
       <w:pPr>
-        <w:spacing w:after="120"/>
-      </w:pPr>
+        <w:spacing w:after="160"/>
+      </w:pPr>
+      <w:r>
+        <w:rPr>
+          <w:rFonts w:ascii="Arial" w:hAnsi="Arial"/>
+          <w:b/>
+          <w:color w:val="2C2C2C"/>
+          <w:sz w:val="20"/>
+        </w:rPr>
+        <w:t>Was ist das Aufenthaltskonzept in Kassel?</w:t>
+      </w:r>
+      <w:r>
+        <w:br/>
+      </w:r>
       <w:r>
         <w:rPr>
           <w:rFonts w:ascii="Arial" w:hAnsi="Arial"/>
@@ -2693,21 +2642,20 @@
     </w:p>
     <w:p>
       <w:pPr>
-        <w:spacing w:after="120"/>
+        <w:spacing w:after="160"/>
       </w:pPr>
       <w:r>
         <w:rPr>
           <w:rFonts w:ascii="Arial" w:hAnsi="Arial"/>
+          <w:b/>
           <w:color w:val="2C2C2C"/>
           <w:sz w:val="20"/>
         </w:rPr>
-        <w:t>Per Schnellbewerbung auf unserer Website, telefonisch oder per E-Mail an pflege@ksk-farmos.de.</w:t>
-      </w:r>
-    </w:p>
-    <w:p>
-      <w:pPr>
-        <w:spacing w:after="120"/>
-      </w:pPr>
+        <w:t>Wie funktioniert der Wechsel aus dem Krankenhaus nach Hause?</w:t>
+      </w:r>
+      <w:r>
+        <w:br/>
+      </w:r>
       <w:r>
         <w:rPr>
           <w:rFonts w:ascii="Arial" w:hAnsi="Arial"/>
@@ -2719,8 +2667,20 @@
     </w:p>
     <w:p>
       <w:pPr>
-        <w:spacing w:after="120"/>
-      </w:pPr>
+        <w:spacing w:after="160"/>
+      </w:pPr>
+      <w:r>
+        <w:rPr>
+          <w:rFonts w:ascii="Arial" w:hAnsi="Arial"/>
+          <w:b/>
+          <w:color w:val="2C2C2C"/>
+          <w:sz w:val="20"/>
+        </w:rPr>
+        <w:t>Müssen wir medizinische Geräte selbst kaufen?</w:t>
+      </w:r>
+      <w:r>
+        <w:br/>
+      </w:r>
       <w:r>
         <w:rPr>
           <w:rFonts w:ascii="Arial" w:hAnsi="Arial"/>
@@ -2732,8 +2692,20 @@
     </w:p>
     <w:p>
       <w:pPr>
-        <w:spacing w:after="120"/>
-      </w:pPr>
+        <w:spacing w:after="160"/>
+      </w:pPr>
+      <w:r>
+        <w:rPr>
+          <w:rFonts w:ascii="Arial" w:hAnsi="Arial"/>
+          <w:b/>
+          <w:color w:val="2C2C2C"/>
+          <w:sz w:val="20"/>
+        </w:rPr>
+        <w:t>Sind auch nachts Pflegekräfte vor Ort?</w:t>
+      </w:r>
+      <w:r>
+        <w:br/>
+      </w:r>
       <w:r>
         <w:rPr>
           <w:rFonts w:ascii="Arial" w:hAnsi="Arial"/>
@@ -2741,19 +2713,6 @@
           <w:sz w:val="20"/>
         </w:rPr>
         <w:t>Ja. Bei der 24-Stunden-Intensivpflege ist immer eine examinierte Pflegefachkraft bei Ihnen vor Ort — auch nachts —, um eine lückenlose und sichere Überwachung zu gewährleisten.</w:t>
-      </w:r>
-    </w:p>
-    <w:p>
-      <w:pPr>
-        <w:spacing w:after="120"/>
-      </w:pPr>
-      <w:r>
-        <w:rPr>
-          <w:rFonts w:ascii="Arial" w:hAnsi="Arial"/>
-          <w:color w:val="2C2C2C"/>
-          <w:sz w:val="20"/>
-        </w:rPr>
-        <w:t>Wir beraten Sie persönlich — unverbindlich und kostenfrei.</w:t>
       </w:r>
     </w:p>
     <w:p>
@@ -2791,170 +2750,6 @@
     </w:p>
     <w:p>
       <w:pPr>
-        <w:spacing w:after="120"/>
-      </w:pPr>
-      <w:r>
-        <w:rPr>
-          <w:rFonts w:ascii="Arial" w:hAnsi="Arial"/>
-          <w:color w:val="2C2C2C"/>
-          <w:sz w:val="20"/>
-        </w:rPr>
-        <w:t>Kostenlos. Unverbindlich. Menschlich.</w:t>
-      </w:r>
-    </w:p>
-    <w:p>
-      <w:pPr>
-        <w:spacing w:after="120"/>
-      </w:pPr>
-      <w:r>
-        <w:rPr>
-          <w:rFonts w:ascii="Arial" w:hAnsi="Arial"/>
-          <w:color w:val="2C2C2C"/>
-          <w:sz w:val="20"/>
-        </w:rPr>
-        <w:t>Ich habe die Datenschutzerklärung gelesen und stimme zu.</w:t>
-      </w:r>
-    </w:p>
-    <w:p>
-      <w:pPr>
-        <w:spacing w:after="160"/>
-      </w:pPr>
-      <w:r>
-        <w:rPr>
-          <w:rFonts w:ascii="Arial" w:hAnsi="Arial"/>
-          <w:b/>
-          <w:color w:val="2C2C2C"/>
-          <w:sz w:val="20"/>
-        </w:rPr>
-        <w:t>Zentrale Volkmarsen</w:t>
-      </w:r>
-      <w:r>
-        <w:br/>
-      </w:r>
-      <w:r>
-        <w:rPr>
-          <w:rFonts w:ascii="Arial" w:hAnsi="Arial"/>
-          <w:color w:val="2C2C2C"/>
-          <w:sz w:val="20"/>
-        </w:rPr>
-        <w:t>05693 / 9189907</w:t>
-      </w:r>
-    </w:p>
-    <w:p>
-      <w:pPr>
-        <w:spacing w:after="160"/>
-      </w:pPr>
-      <w:r>
-        <w:rPr>
-          <w:rFonts w:ascii="Arial" w:hAnsi="Arial"/>
-          <w:b/>
-          <w:color w:val="2C2C2C"/>
-          <w:sz w:val="20"/>
-        </w:rPr>
-        <w:t>Zentrale Volkmarsen</w:t>
-      </w:r>
-      <w:r>
-        <w:br/>
-      </w:r>
-      <w:r>
-        <w:rPr>
-          <w:rFonts w:ascii="Arial" w:hAnsi="Arial"/>
-          <w:color w:val="2C2C2C"/>
-          <w:sz w:val="20"/>
-        </w:rPr>
-        <w:t>05693 / 9189907</w:t>
-      </w:r>
-    </w:p>
-    <w:p>
-      <w:pPr>
-        <w:spacing w:after="160"/>
-      </w:pPr>
-      <w:r>
-        <w:rPr>
-          <w:rFonts w:ascii="Arial" w:hAnsi="Arial"/>
-          <w:b/>
-          <w:color w:val="2C2C2C"/>
-          <w:sz w:val="20"/>
-        </w:rPr>
-        <w:t>Mobil / 24h</w:t>
-      </w:r>
-      <w:r>
-        <w:br/>
-      </w:r>
-      <w:r>
-        <w:rPr>
-          <w:rFonts w:ascii="Arial" w:hAnsi="Arial"/>
-          <w:color w:val="2C2C2C"/>
-          <w:sz w:val="20"/>
-        </w:rPr>
-        <w:t>0170 / 7652593</w:t>
-      </w:r>
-    </w:p>
-    <w:p>
-      <w:pPr>
-        <w:spacing w:after="160"/>
-      </w:pPr>
-      <w:r>
-        <w:rPr>
-          <w:rFonts w:ascii="Arial" w:hAnsi="Arial"/>
-          <w:b/>
-          <w:color w:val="2C2C2C"/>
-          <w:sz w:val="20"/>
-        </w:rPr>
-        <w:t>E-Mail</w:t>
-      </w:r>
-      <w:r>
-        <w:br/>
-      </w:r>
-      <w:r>
-        <w:rPr>
-          <w:rFonts w:ascii="Arial" w:hAnsi="Arial"/>
-          <w:color w:val="2C2C2C"/>
-          <w:sz w:val="20"/>
-        </w:rPr>
-        <w:t>pflege@ksk-farmos.de</w:t>
-      </w:r>
-    </w:p>
-    <w:p>
-      <w:pPr>
-        <w:spacing w:after="160"/>
-      </w:pPr>
-      <w:r>
-        <w:rPr>
-          <w:rFonts w:ascii="Arial" w:hAnsi="Arial"/>
-          <w:b/>
-          <w:color w:val="2C2C2C"/>
-          <w:sz w:val="20"/>
-        </w:rPr>
-        <w:t>Fax</w:t>
-      </w:r>
-      <w:r>
-        <w:br/>
-      </w:r>
-      <w:r>
-        <w:rPr>
-          <w:rFonts w:ascii="Arial" w:hAnsi="Arial"/>
-          <w:color w:val="2C2C2C"/>
-          <w:sz w:val="20"/>
-        </w:rPr>
-        <w:t>05693 / 3599847</w:t>
-      </w:r>
-    </w:p>
-    <w:p>
-      <w:pPr>
-        <w:spacing w:after="120"/>
-      </w:pPr>
-      <w:r>
-        <w:rPr>
-          <w:rFonts w:ascii="Arial" w:hAnsi="Arial"/>
-          <w:color w:val="2C2C2C"/>
-          <w:sz w:val="20"/>
-        </w:rPr>
-        <w:t>Füllen Sie das Formular aus und wir melden uns innerhalb von 24 Stunden.</w:t>
-      </w:r>
-    </w:p>
-    <w:p>
-      <w:pPr>
         <w:keepNext/>
         <w:spacing w:before="280" w:after="160"/>
       </w:pPr>
@@ -2965,62 +2760,38 @@
           <w:color w:val="4C2B73"/>
           <w:sz w:val="26"/>
         </w:rPr>
-        <w:t>Wo Sie uns finden</w:t>
+        <w:t>Sprechen Sie uns an — Kostenlos. Unverbindlich. Menschlich.</w:t>
       </w:r>
     </w:p>
     <w:p>
       <w:pPr>
-        <w:spacing w:after="160"/>
-      </w:pPr>
-      <w:r>
-        <w:rPr>
-          <w:rFonts w:ascii="Arial" w:hAnsi="Arial"/>
-          <w:b/>
-          <w:color w:val="2C2C2C"/>
-          <w:sz w:val="20"/>
-        </w:rPr>
-        <w:t>Hauptzentrale Volkmarsen</w:t>
-      </w:r>
-      <w:r>
-        <w:br/>
-      </w:r>
+        <w:spacing w:after="80"/>
+      </w:pPr>
       <w:r>
         <w:rPr>
           <w:rFonts w:ascii="Arial" w:hAnsi="Arial"/>
           <w:color w:val="2C2C2C"/>
           <w:sz w:val="20"/>
         </w:rPr>
-        <w:t>Ehringer Weg 2b34471 Volkmarsen</w:t>
+        <w:t>•  Zentrale Volkmarsen: 05693 / 9189907</w:t>
       </w:r>
     </w:p>
     <w:p>
       <w:pPr>
-        <w:spacing w:after="160"/>
-      </w:pPr>
-      <w:r>
-        <w:rPr>
-          <w:rFonts w:ascii="Arial" w:hAnsi="Arial"/>
-          <w:b/>
-          <w:color w:val="2C2C2C"/>
-          <w:sz w:val="20"/>
-        </w:rPr>
-        <w:t>Aufenthaltskonzept Kassel</w:t>
-      </w:r>
-      <w:r>
-        <w:br/>
-      </w:r>
+        <w:spacing w:after="80"/>
+      </w:pPr>
       <w:r>
         <w:rPr>
           <w:rFonts w:ascii="Arial" w:hAnsi="Arial"/>
           <w:color w:val="2C2C2C"/>
           <w:sz w:val="20"/>
         </w:rPr>
-        <w:t>Sommerbergstraße 1434123 Kassel</w:t>
+        <w:t>•  Mobil / 24h-Bereitschaft: 0170 / 7652593</w:t>
       </w:r>
     </w:p>
     <w:p>
       <w:pPr>
-        <w:spacing w:after="120"/>
+        <w:spacing w:after="80"/>
       </w:pPr>
       <w:r>
         <w:rPr>
@@ -3028,7 +2799,20 @@
           <w:color w:val="2C2C2C"/>
           <w:sz w:val="20"/>
         </w:rPr>
-        <w:t>Wir beraten Sie persönlich — unverbindlich und kostenfrei.</w:t>
+        <w:t>•  Faxnummer: 05693 / 9189908</w:t>
+      </w:r>
+    </w:p>
+    <w:p>
+      <w:pPr>
+        <w:spacing w:after="80"/>
+      </w:pPr>
+      <w:r>
+        <w:rPr>
+          <w:rFonts w:ascii="Arial" w:hAnsi="Arial"/>
+          <w:color w:val="2C2C2C"/>
+          <w:sz w:val="20"/>
+        </w:rPr>
+        <w:t>•  E-Mail: pflege@ksk-farmos.de</w:t>
       </w:r>
     </w:p>
     <w:p>
@@ -3076,7 +2860,7 @@
           <w:color w:val="4C2B73"/>
           <w:sz w:val="26"/>
         </w:rPr>
-        <w:t>Kostenloses Erstgespräch</w:t>
+        <w:t>Kostenlose Erstberatung</w:t>
       </w:r>
     </w:p>
     <w:p>
@@ -3094,64 +2878,7 @@
     </w:p>
     <w:p>
       <w:pPr>
-        <w:keepNext/>
-        <w:spacing w:before="280" w:after="160"/>
-      </w:pPr>
-      <w:r>
-        <w:rPr>
-          <w:rFonts w:ascii="Georgia" w:hAnsi="Georgia"/>
-          <w:b/>
-          <w:color w:val="4C2B73"/>
-          <w:sz w:val="26"/>
-        </w:rPr>
-        <w:t>Wir sind für Sie da</w:t>
-      </w:r>
-    </w:p>
-    <w:p>
-      <w:pPr>
-        <w:spacing w:after="160"/>
-      </w:pPr>
-      <w:r>
-        <w:rPr>
-          <w:rFonts w:ascii="Arial" w:hAnsi="Arial"/>
-          <w:b/>
-          <w:color w:val="2C2C2C"/>
-          <w:sz w:val="20"/>
-        </w:rPr>
-        <w:t>Kostenlos und unverbindlich</w:t>
-      </w:r>
-    </w:p>
-    <w:p>
-      <w:pPr>
-        <w:spacing w:after="160"/>
-      </w:pPr>
-      <w:r>
-        <w:rPr>
-          <w:rFonts w:ascii="Arial" w:hAnsi="Arial"/>
-          <w:b/>
-          <w:color w:val="2C2C2C"/>
-          <w:sz w:val="20"/>
-        </w:rPr>
-        <w:t>Persönlich oder telefonisch</w:t>
-      </w:r>
-    </w:p>
-    <w:p>
-      <w:pPr>
-        <w:spacing w:after="160"/>
-      </w:pPr>
-      <w:r>
-        <w:rPr>
-          <w:rFonts w:ascii="Arial" w:hAnsi="Arial"/>
-          <w:b/>
-          <w:color w:val="2C2C2C"/>
-          <w:sz w:val="20"/>
-        </w:rPr>
-        <w:t>Rückmeldung innerhalb 24h</w:t>
-      </w:r>
-    </w:p>
-    <w:p>
-      <w:pPr>
-        <w:spacing w:after="160"/>
+        <w:spacing w:after="120"/>
       </w:pPr>
       <w:r>
         <w:rPr>
@@ -3159,12 +2886,7 @@
           <w:color w:val="2C2C2C"/>
           <w:sz w:val="20"/>
         </w:rPr>
-        <w:t>Ich habe die Datenschutzerklärung gelesen und stimme zu.</w:t>
-      </w:r>
-    </w:p>
-    <w:p>
-      <w:r>
-        <w:br w:type="page"/>
+        <w:t>Rückmeldung innerhalb 24 Stunden — garantiert. Wir klären alle Ihre Fragen zur 24h-Intensivpflege und der Finanzierung.</w:t>
       </w:r>
     </w:p>
     <w:sectPr>

</xml_diff>